<commit_message>
Changed Team 1's assignment.
</commit_message>
<xml_diff>
--- a/00_Project_Management/assignments/Milestone_3_Components/Team1/M3_Team1_UI_View_Assignment.docx
+++ b/00_Project_Management/assignments/Milestone_3_Components/Team1/M3_Team1_UI_View_Assignment.docx
@@ -24,18 +24,7 @@
           <w:szCs w:val="36"/>
           <w:lang w:eastAsia="en-US"/>
         </w:rPr>
-        <w:t>2.6</w:t>
-      </w:r>
-      <w:r>
-        <w:rPr>
-          <w:rFonts w:eastAsia="Times New Roman" w:cs="Times New Roman"/>
-          <w:b/>
-          <w:bCs/>
-          <w:sz w:val="36"/>
-          <w:szCs w:val="36"/>
-          <w:lang w:eastAsia="en-US"/>
-        </w:rPr>
-        <w:t xml:space="preserve"> </w:t>
+        <w:t xml:space="preserve">2.6 </w:t>
       </w:r>
       <w:r>
         <w:rPr>
@@ -726,16 +715,7 @@
           <w:szCs w:val="20"/>
           <w:lang w:eastAsia="en-US"/>
         </w:rPr>
-        <w:t>Job</w:t>
-      </w:r>
-      <w:r>
-        <w:rPr>
-          <w:rFonts w:eastAsia="Times New Roman" w:cs="Courier New"/>
-          <w:sz w:val="20"/>
-          <w:szCs w:val="20"/>
-          <w:lang w:eastAsia="en-US"/>
-        </w:rPr>
-        <w:t xml:space="preserve"> Details</w:t>
+        <w:t>Job Details</w:t>
       </w:r>
     </w:p>
     <w:p>
@@ -908,7 +888,6 @@
         </w:rPr>
         <w:tab/>
       </w:r>
-      <w:proofErr w:type="gramStart"/>
       <w:r>
         <w:rPr>
           <w:rFonts w:eastAsia="Times New Roman" w:cs="Courier New"/>
@@ -916,29 +895,8 @@
           <w:szCs w:val="20"/>
           <w:lang w:eastAsia="en-US"/>
         </w:rPr>
-        <w:t>[ Apply</w:t>
-      </w:r>
-      <w:proofErr w:type="gramEnd"/>
-      <w:r>
-        <w:rPr>
-          <w:rFonts w:eastAsia="Times New Roman" w:cs="Courier New"/>
-          <w:sz w:val="20"/>
-          <w:szCs w:val="20"/>
-          <w:lang w:eastAsia="en-US"/>
-        </w:rPr>
-        <w:t xml:space="preserve"> </w:t>
-      </w:r>
-      <w:proofErr w:type="gramStart"/>
-      <w:r>
-        <w:rPr>
-          <w:rFonts w:eastAsia="Times New Roman" w:cs="Courier New"/>
-          <w:sz w:val="20"/>
-          <w:szCs w:val="20"/>
-          <w:lang w:eastAsia="en-US"/>
-        </w:rPr>
-        <w:t>Button ]</w:t>
-      </w:r>
-      <w:proofErr w:type="gramEnd"/>
+        <w:t>[ Apply Button ]</w:t>
+      </w:r>
     </w:p>
     <w:p>
       <w:pPr>
@@ -977,7 +935,6 @@
           <w:lang w:eastAsia="en-US"/>
         </w:rPr>
       </w:pPr>
-      <w:proofErr w:type="gramStart"/>
       <w:r>
         <w:rPr>
           <w:rFonts w:eastAsia="Times New Roman" w:cs="Courier New"/>
@@ -985,9 +942,8 @@
           <w:szCs w:val="20"/>
           <w:lang w:eastAsia="en-US"/>
         </w:rPr>
-        <w:t>[ Application</w:t>
-      </w:r>
-      <w:proofErr w:type="gramEnd"/>
+        <w:t>[ Application Submitted ]</w:t>
+      </w:r>
       <w:r>
         <w:rPr>
           <w:rFonts w:eastAsia="Times New Roman" w:cs="Courier New"/>
@@ -995,59 +951,9 @@
           <w:szCs w:val="20"/>
           <w:lang w:eastAsia="en-US"/>
         </w:rPr>
-        <w:t xml:space="preserve"> </w:t>
-      </w:r>
-      <w:proofErr w:type="gramStart"/>
-      <w:r>
-        <w:rPr>
-          <w:rFonts w:eastAsia="Times New Roman" w:cs="Courier New"/>
-          <w:sz w:val="20"/>
-          <w:szCs w:val="20"/>
-          <w:lang w:eastAsia="en-US"/>
-        </w:rPr>
-        <w:t>Submitted ]</w:t>
-      </w:r>
-      <w:proofErr w:type="gramEnd"/>
-      <w:r>
-        <w:rPr>
-          <w:rFonts w:eastAsia="Times New Roman" w:cs="Courier New"/>
-          <w:sz w:val="20"/>
-          <w:szCs w:val="20"/>
-          <w:lang w:eastAsia="en-US"/>
-        </w:rPr>
         <w:br/>
-      </w:r>
-      <w:proofErr w:type="gramStart"/>
-      <w:r>
-        <w:rPr>
-          <w:rFonts w:eastAsia="Times New Roman" w:cs="Courier New"/>
-          <w:sz w:val="20"/>
-          <w:szCs w:val="20"/>
-          <w:lang w:eastAsia="en-US"/>
-        </w:rPr>
-        <w:t>[ View</w:t>
-      </w:r>
-      <w:proofErr w:type="gramEnd"/>
-      <w:r>
-        <w:rPr>
-          <w:rFonts w:eastAsia="Times New Roman" w:cs="Courier New"/>
-          <w:sz w:val="20"/>
-          <w:szCs w:val="20"/>
-          <w:lang w:eastAsia="en-US"/>
-        </w:rPr>
-        <w:t xml:space="preserve"> Application </w:t>
-      </w:r>
-      <w:proofErr w:type="gramStart"/>
-      <w:r>
-        <w:rPr>
-          <w:rFonts w:eastAsia="Times New Roman" w:cs="Courier New"/>
-          <w:sz w:val="20"/>
-          <w:szCs w:val="20"/>
-          <w:lang w:eastAsia="en-US"/>
-        </w:rPr>
-        <w:t>Status ]</w:t>
-      </w:r>
-      <w:proofErr w:type="gramEnd"/>
+        <w:t>[ View Application Status ]</w:t>
+      </w:r>
     </w:p>
     <w:p>
       <w:pPr>
@@ -1451,8 +1357,19 @@
           <w:u w:val="single"/>
           <w:lang w:eastAsia="en-US"/>
         </w:rPr>
-      </w:pPr>
-      <w:r>
+        <w:sectPr>
+          <w:type w:val="continuous"/>
+          <w:pgSz w:w="12240" w:h="15840"/>
+          <w:pgMar w:top="1440" w:right="1440" w:bottom="1440" w:left="1440" w:header="720" w:footer="720" w:gutter="0"/>
+          <w:cols w:num="2" w:space="720"/>
+          <w:docGrid w:linePitch="360"/>
+        </w:sectPr>
+      </w:pPr>
+    </w:p>
+    <w:p>
+      <w:pPr>
+        <w:spacing w:line="240" w:lineRule="auto"/>
+        <w:outlineLvl w:val="0"/>
         <w:rPr>
           <w:rFonts w:eastAsia="Times New Roman" w:cs="Times New Roman"/>
           <w:b/>
@@ -1462,8 +1379,7 @@
           <w:u w:val="single"/>
           <w:lang w:eastAsia="en-US"/>
         </w:rPr>
-        <w:t xml:space="preserve">Additional </w:t>
-      </w:r>
+      </w:pPr>
       <w:r>
         <w:rPr>
           <w:rFonts w:eastAsia="Times New Roman" w:cs="Times New Roman"/>
@@ -1474,8 +1390,29 @@
           <w:u w:val="single"/>
           <w:lang w:eastAsia="en-US"/>
         </w:rPr>
-        <w:t>Navigation Path</w:t>
-      </w:r>
+        <w:t>Additional Navigation Path</w:t>
+      </w:r>
+    </w:p>
+    <w:p>
+      <w:pPr>
+        <w:spacing w:before="240" w:line="240" w:lineRule="auto"/>
+        <w:outlineLvl w:val="2"/>
+        <w:rPr>
+          <w:rFonts w:eastAsia="Times New Roman" w:cs="Times New Roman"/>
+          <w:b/>
+          <w:bCs/>
+          <w:sz w:val="27"/>
+          <w:szCs w:val="27"/>
+          <w:lang w:eastAsia="en-US"/>
+        </w:rPr>
+        <w:sectPr>
+          <w:type w:val="continuous"/>
+          <w:pgSz w:w="12240" w:h="15840"/>
+          <w:pgMar w:top="1440" w:right="1440" w:bottom="1440" w:left="1440" w:header="720" w:footer="720" w:gutter="0"/>
+          <w:cols w:space="720"/>
+          <w:docGrid w:linePitch="360"/>
+        </w:sectPr>
+      </w:pPr>
     </w:p>
     <w:p>
       <w:pPr>
@@ -1657,180 +1594,6 @@
     </w:p>
     <w:p>
       <w:pPr>
-        <w:tabs>
-          <w:tab w:val="left" w:pos="916"/>
-          <w:tab w:val="left" w:pos="1832"/>
-          <w:tab w:val="left" w:pos="2748"/>
-          <w:tab w:val="left" w:pos="3664"/>
-          <w:tab w:val="left" w:pos="4580"/>
-          <w:tab w:val="left" w:pos="5496"/>
-          <w:tab w:val="left" w:pos="6412"/>
-          <w:tab w:val="left" w:pos="7328"/>
-          <w:tab w:val="left" w:pos="8244"/>
-          <w:tab w:val="left" w:pos="9160"/>
-          <w:tab w:val="left" w:pos="10076"/>
-          <w:tab w:val="left" w:pos="10992"/>
-          <w:tab w:val="left" w:pos="11908"/>
-          <w:tab w:val="left" w:pos="12824"/>
-          <w:tab w:val="left" w:pos="13740"/>
-          <w:tab w:val="left" w:pos="14656"/>
-        </w:tabs>
-        <w:spacing w:line="240" w:lineRule="auto"/>
-        <w:rPr>
-          <w:rFonts w:eastAsia="Times New Roman" w:cs="Courier New"/>
-          <w:sz w:val="20"/>
-          <w:szCs w:val="20"/>
-          <w:lang w:eastAsia="en-US"/>
-        </w:rPr>
-      </w:pPr>
-    </w:p>
-    <w:p>
-      <w:pPr>
-        <w:tabs>
-          <w:tab w:val="left" w:pos="916"/>
-          <w:tab w:val="left" w:pos="1832"/>
-          <w:tab w:val="left" w:pos="2748"/>
-          <w:tab w:val="left" w:pos="3664"/>
-          <w:tab w:val="left" w:pos="4580"/>
-          <w:tab w:val="left" w:pos="5496"/>
-          <w:tab w:val="left" w:pos="6412"/>
-          <w:tab w:val="left" w:pos="7328"/>
-          <w:tab w:val="left" w:pos="8244"/>
-          <w:tab w:val="left" w:pos="9160"/>
-          <w:tab w:val="left" w:pos="10076"/>
-          <w:tab w:val="left" w:pos="10992"/>
-          <w:tab w:val="left" w:pos="11908"/>
-          <w:tab w:val="left" w:pos="12824"/>
-          <w:tab w:val="left" w:pos="13740"/>
-          <w:tab w:val="left" w:pos="14656"/>
-        </w:tabs>
-        <w:spacing w:line="240" w:lineRule="auto"/>
-        <w:rPr>
-          <w:rFonts w:eastAsia="Times New Roman" w:cs="Courier New"/>
-          <w:sz w:val="20"/>
-          <w:szCs w:val="20"/>
-          <w:lang w:eastAsia="en-US"/>
-        </w:rPr>
-      </w:pPr>
-    </w:p>
-    <w:p>
-      <w:pPr>
-        <w:tabs>
-          <w:tab w:val="left" w:pos="916"/>
-          <w:tab w:val="left" w:pos="1832"/>
-          <w:tab w:val="left" w:pos="2748"/>
-          <w:tab w:val="left" w:pos="3664"/>
-          <w:tab w:val="left" w:pos="4580"/>
-          <w:tab w:val="left" w:pos="5496"/>
-          <w:tab w:val="left" w:pos="6412"/>
-          <w:tab w:val="left" w:pos="7328"/>
-          <w:tab w:val="left" w:pos="8244"/>
-          <w:tab w:val="left" w:pos="9160"/>
-          <w:tab w:val="left" w:pos="10076"/>
-          <w:tab w:val="left" w:pos="10992"/>
-          <w:tab w:val="left" w:pos="11908"/>
-          <w:tab w:val="left" w:pos="12824"/>
-          <w:tab w:val="left" w:pos="13740"/>
-          <w:tab w:val="left" w:pos="14656"/>
-        </w:tabs>
-        <w:spacing w:line="240" w:lineRule="auto"/>
-        <w:rPr>
-          <w:rFonts w:eastAsia="Times New Roman" w:cs="Courier New"/>
-          <w:sz w:val="20"/>
-          <w:szCs w:val="20"/>
-          <w:lang w:eastAsia="en-US"/>
-        </w:rPr>
-      </w:pPr>
-    </w:p>
-    <w:p>
-      <w:pPr>
-        <w:tabs>
-          <w:tab w:val="left" w:pos="916"/>
-          <w:tab w:val="left" w:pos="1832"/>
-          <w:tab w:val="left" w:pos="2748"/>
-          <w:tab w:val="left" w:pos="3664"/>
-          <w:tab w:val="left" w:pos="4580"/>
-          <w:tab w:val="left" w:pos="5496"/>
-          <w:tab w:val="left" w:pos="6412"/>
-          <w:tab w:val="left" w:pos="7328"/>
-          <w:tab w:val="left" w:pos="8244"/>
-          <w:tab w:val="left" w:pos="9160"/>
-          <w:tab w:val="left" w:pos="10076"/>
-          <w:tab w:val="left" w:pos="10992"/>
-          <w:tab w:val="left" w:pos="11908"/>
-          <w:tab w:val="left" w:pos="12824"/>
-          <w:tab w:val="left" w:pos="13740"/>
-          <w:tab w:val="left" w:pos="14656"/>
-        </w:tabs>
-        <w:spacing w:line="240" w:lineRule="auto"/>
-        <w:rPr>
-          <w:rFonts w:eastAsia="Times New Roman" w:cs="Courier New"/>
-          <w:sz w:val="20"/>
-          <w:szCs w:val="20"/>
-          <w:lang w:eastAsia="en-US"/>
-        </w:rPr>
-      </w:pPr>
-    </w:p>
-    <w:p>
-      <w:pPr>
-        <w:tabs>
-          <w:tab w:val="left" w:pos="916"/>
-          <w:tab w:val="left" w:pos="1832"/>
-          <w:tab w:val="left" w:pos="2748"/>
-          <w:tab w:val="left" w:pos="3664"/>
-          <w:tab w:val="left" w:pos="4580"/>
-          <w:tab w:val="left" w:pos="5496"/>
-          <w:tab w:val="left" w:pos="6412"/>
-          <w:tab w:val="left" w:pos="7328"/>
-          <w:tab w:val="left" w:pos="8244"/>
-          <w:tab w:val="left" w:pos="9160"/>
-          <w:tab w:val="left" w:pos="10076"/>
-          <w:tab w:val="left" w:pos="10992"/>
-          <w:tab w:val="left" w:pos="11908"/>
-          <w:tab w:val="left" w:pos="12824"/>
-          <w:tab w:val="left" w:pos="13740"/>
-          <w:tab w:val="left" w:pos="14656"/>
-        </w:tabs>
-        <w:spacing w:line="240" w:lineRule="auto"/>
-        <w:rPr>
-          <w:rFonts w:eastAsia="Times New Roman" w:cs="Courier New"/>
-          <w:sz w:val="20"/>
-          <w:szCs w:val="20"/>
-          <w:lang w:eastAsia="en-US"/>
-        </w:rPr>
-      </w:pPr>
-    </w:p>
-    <w:p>
-      <w:pPr>
-        <w:tabs>
-          <w:tab w:val="left" w:pos="916"/>
-          <w:tab w:val="left" w:pos="1832"/>
-          <w:tab w:val="left" w:pos="2748"/>
-          <w:tab w:val="left" w:pos="3664"/>
-          <w:tab w:val="left" w:pos="4580"/>
-          <w:tab w:val="left" w:pos="5496"/>
-          <w:tab w:val="left" w:pos="6412"/>
-          <w:tab w:val="left" w:pos="7328"/>
-          <w:tab w:val="left" w:pos="8244"/>
-          <w:tab w:val="left" w:pos="9160"/>
-          <w:tab w:val="left" w:pos="10076"/>
-          <w:tab w:val="left" w:pos="10992"/>
-          <w:tab w:val="left" w:pos="11908"/>
-          <w:tab w:val="left" w:pos="12824"/>
-          <w:tab w:val="left" w:pos="13740"/>
-          <w:tab w:val="left" w:pos="14656"/>
-        </w:tabs>
-        <w:spacing w:line="240" w:lineRule="auto"/>
-        <w:rPr>
-          <w:rFonts w:eastAsia="Times New Roman" w:cs="Courier New"/>
-          <w:sz w:val="20"/>
-          <w:szCs w:val="20"/>
-          <w:lang w:eastAsia="en-US"/>
-        </w:rPr>
-      </w:pPr>
-    </w:p>
-    <w:p>
-      <w:pPr>
         <w:spacing w:line="240" w:lineRule="auto"/>
         <w:outlineLvl w:val="2"/>
         <w:rPr>
@@ -1956,6 +1719,63 @@
         </w:rPr>
         <w:t>Application Status / Tracking Screen</w:t>
       </w:r>
+    </w:p>
+    <w:p>
+      <w:pPr>
+        <w:rPr>
+          <w:rFonts w:eastAsia="Times New Roman" w:cs="Courier New"/>
+          <w:sz w:val="20"/>
+          <w:szCs w:val="20"/>
+          <w:lang w:eastAsia="en-US"/>
+        </w:rPr>
+        <w:sectPr>
+          <w:type w:val="continuous"/>
+          <w:pgSz w:w="12240" w:h="15840"/>
+          <w:pgMar w:top="1440" w:right="1440" w:bottom="1440" w:left="1440" w:header="720" w:footer="720" w:gutter="0"/>
+          <w:cols w:num="2" w:space="720"/>
+          <w:docGrid w:linePitch="360"/>
+        </w:sectPr>
+      </w:pPr>
+    </w:p>
+    <w:p>
+      <w:pPr>
+        <w:rPr>
+          <w:rFonts w:eastAsia="Times New Roman" w:cs="Courier New"/>
+          <w:sz w:val="20"/>
+          <w:szCs w:val="20"/>
+          <w:lang w:eastAsia="en-US"/>
+        </w:rPr>
+      </w:pPr>
+    </w:p>
+    <w:p>
+      <w:pPr>
+        <w:rPr>
+          <w:rFonts w:eastAsia="Times New Roman" w:cs="Courier New"/>
+          <w:sz w:val="20"/>
+          <w:szCs w:val="20"/>
+          <w:lang w:eastAsia="en-US"/>
+        </w:rPr>
+      </w:pPr>
+    </w:p>
+    <w:p>
+      <w:pPr>
+        <w:rPr>
+          <w:rFonts w:eastAsia="Times New Roman" w:cs="Courier New"/>
+          <w:sz w:val="20"/>
+          <w:szCs w:val="20"/>
+          <w:lang w:eastAsia="en-US"/>
+        </w:rPr>
+      </w:pPr>
+    </w:p>
+    <w:p>
+      <w:pPr>
+        <w:rPr>
+          <w:rFonts w:eastAsia="Times New Roman" w:cs="Courier New"/>
+          <w:sz w:val="20"/>
+          <w:szCs w:val="20"/>
+          <w:lang w:eastAsia="en-US"/>
+        </w:rPr>
+      </w:pPr>
     </w:p>
     <w:sectPr>
       <w:type w:val="continuous"/>

</xml_diff>